<commit_message>
Kleurenpalette documentatie uitgebreid en readme aangepast
</commit_message>
<xml_diff>
--- a/documentation/Kleurenpalette_ZakiBegzad.docx
+++ b/documentation/Kleurenpalette_ZakiBegzad.docx
@@ -12,6 +12,7 @@
           <w:sz w:val="44"/>
         </w:rPr>
       </w:pPr>
+      <w:proofErr w:type="spellStart"/>
       <w:r>
         <w:rPr>
           <w:rFonts w:ascii="Georgia" w:hAnsi="Georgia"/>
@@ -19,7 +20,17 @@
           <w:color w:val="000000"/>
           <w:sz w:val="44"/>
         </w:rPr>
-        <w:t>Kleurenpalette — Portfolio Zaki Begzad</w:t>
+        <w:t>Kleurenpalette</w:t>
+      </w:r>
+      <w:proofErr w:type="spellEnd"/>
+      <w:r>
+        <w:rPr>
+          <w:rFonts w:ascii="Georgia" w:hAnsi="Georgia"/>
+          <w:b/>
+          <w:color w:val="000000"/>
+          <w:sz w:val="44"/>
+        </w:rPr>
+        <w:t xml:space="preserve"> — Portfolio Zaki Begzad</w:t>
       </w:r>
     </w:p>
     <w:p>
@@ -65,7 +76,25 @@
           <w:color w:val="000000"/>
           <w:sz w:val="22"/>
         </w:rPr>
-        <w:t>Het kleurenpalette van dit portfolio is gebaseerd op de esthetiek van klassieke boekdruk en achttiende-eeuwse schilderkunst. De combinatie van diepe bruintonen, bordeauxrood en goudaccenten geeft de site een tijdloze, elegante uitstraling. Wit en gebroken wit zorgen voor leesbaarheid en rust in de lichtere secties.</w:t>
+        <w:t xml:space="preserve">Het </w:t>
+      </w:r>
+      <w:proofErr w:type="spellStart"/>
+      <w:r>
+        <w:rPr>
+          <w:rFonts w:ascii="Georgia" w:hAnsi="Georgia"/>
+          <w:color w:val="000000"/>
+          <w:sz w:val="22"/>
+        </w:rPr>
+        <w:t>kleurenpalette</w:t>
+      </w:r>
+      <w:proofErr w:type="spellEnd"/>
+      <w:r>
+        <w:rPr>
+          <w:rFonts w:ascii="Georgia" w:hAnsi="Georgia"/>
+          <w:color w:val="000000"/>
+          <w:sz w:val="22"/>
+        </w:rPr>
+        <w:t xml:space="preserve"> van dit portfolio is gebaseerd op de esthetiek van klassieke boekdruk en achttiende-eeuwse schilderkunst. De combinatie van diepe bruintonen, bordeauxrood en goudaccenten geeft de site een tijdloze, elegante uitstraling. Wit en gebroken wit zorgen voor leesbaarheid en rust in de lichtere secties.</w:t>
       </w:r>
     </w:p>
     <w:p>
@@ -93,12 +122,6 @@
         <w:gridCol w:w="7056"/>
       </w:tblGrid>
       <w:tr>
-        <w:tblPrEx>
-          <w:tblCellMar>
-            <w:top w:w="0" w:type="dxa"/>
-            <w:bottom w:w="0" w:type="dxa"/>
-          </w:tblCellMar>
-        </w:tblPrEx>
         <w:trPr>
           <w:trHeight w:hRule="exact" w:val="1440"/>
         </w:trPr>
@@ -176,8 +199,18 @@
                 <w:color w:val="777777"/>
                 <w:sz w:val="18"/>
               </w:rPr>
-              <w:t>#FFFFFF    --white</w:t>
-            </w:r>
+              <w:t>#FFFFFF    --</w:t>
+            </w:r>
+            <w:proofErr w:type="spellStart"/>
+            <w:r>
+              <w:rPr>
+                <w:rFonts w:ascii="Courier New" w:hAnsi="Courier New" w:cs="Courier New"/>
+                <w:color w:val="777777"/>
+                <w:sz w:val="18"/>
+              </w:rPr>
+              <w:t>white</w:t>
+            </w:r>
+            <w:proofErr w:type="spellEnd"/>
           </w:p>
           <w:p>
             <w:pPr>
@@ -225,12 +258,6 @@
         <w:gridCol w:w="7056"/>
       </w:tblGrid>
       <w:tr>
-        <w:tblPrEx>
-          <w:tblCellMar>
-            <w:top w:w="0" w:type="dxa"/>
-            <w:bottom w:w="0" w:type="dxa"/>
-          </w:tblCellMar>
-        </w:tblPrEx>
         <w:trPr>
           <w:trHeight w:hRule="exact" w:val="1440"/>
         </w:trPr>
@@ -308,8 +335,18 @@
                 <w:color w:val="777777"/>
                 <w:sz w:val="18"/>
               </w:rPr>
-              <w:t>#F7F3EE    --off-white</w:t>
-            </w:r>
+              <w:t>#F7F3EE    --</w:t>
+            </w:r>
+            <w:proofErr w:type="spellStart"/>
+            <w:r>
+              <w:rPr>
+                <w:rFonts w:ascii="Courier New" w:hAnsi="Courier New" w:cs="Courier New"/>
+                <w:color w:val="777777"/>
+                <w:sz w:val="18"/>
+              </w:rPr>
+              <w:t>off-white</w:t>
+            </w:r>
+            <w:proofErr w:type="spellEnd"/>
           </w:p>
           <w:p>
             <w:pPr>
@@ -357,12 +394,6 @@
         <w:gridCol w:w="7056"/>
       </w:tblGrid>
       <w:tr>
-        <w:tblPrEx>
-          <w:tblCellMar>
-            <w:top w:w="0" w:type="dxa"/>
-            <w:bottom w:w="0" w:type="dxa"/>
-          </w:tblCellMar>
-        </w:tblPrEx>
         <w:trPr>
           <w:trHeight w:hRule="exact" w:val="1440"/>
         </w:trPr>
@@ -431,8 +462,18 @@
                 <w:color w:val="777777"/>
                 <w:sz w:val="18"/>
               </w:rPr>
-              <w:t>#221108    --brown</w:t>
-            </w:r>
+              <w:t>#221108    --</w:t>
+            </w:r>
+            <w:proofErr w:type="spellStart"/>
+            <w:r>
+              <w:rPr>
+                <w:rFonts w:ascii="Courier New" w:hAnsi="Courier New" w:cs="Courier New"/>
+                <w:color w:val="777777"/>
+                <w:sz w:val="18"/>
+              </w:rPr>
+              <w:t>brown</w:t>
+            </w:r>
+            <w:proofErr w:type="spellEnd"/>
           </w:p>
           <w:p>
             <w:pPr>
@@ -449,7 +490,61 @@
                 <w:color w:val="000000"/>
                 <w:sz w:val="20"/>
               </w:rPr>
-              <w:t>Hoofdkleur voor de hero, projectensectie en footer. Geeft de site zijn donkere, filmische karakter — geïnspireerd op Barry Lyndon.</w:t>
+              <w:t xml:space="preserve">Hoofdkleur voor de </w:t>
+            </w:r>
+            <w:proofErr w:type="spellStart"/>
+            <w:r>
+              <w:rPr>
+                <w:rFonts w:ascii="Georgia" w:hAnsi="Georgia" w:cs="Courier New"/>
+                <w:color w:val="000000"/>
+                <w:sz w:val="20"/>
+              </w:rPr>
+              <w:t>hero</w:t>
+            </w:r>
+            <w:proofErr w:type="spellEnd"/>
+            <w:r>
+              <w:rPr>
+                <w:rFonts w:ascii="Georgia" w:hAnsi="Georgia" w:cs="Courier New"/>
+                <w:color w:val="000000"/>
+                <w:sz w:val="20"/>
+              </w:rPr>
+              <w:t xml:space="preserve">, projectensectie en </w:t>
+            </w:r>
+            <w:proofErr w:type="spellStart"/>
+            <w:r>
+              <w:rPr>
+                <w:rFonts w:ascii="Georgia" w:hAnsi="Georgia" w:cs="Courier New"/>
+                <w:color w:val="000000"/>
+                <w:sz w:val="20"/>
+              </w:rPr>
+              <w:t>footer</w:t>
+            </w:r>
+            <w:proofErr w:type="spellEnd"/>
+            <w:r>
+              <w:rPr>
+                <w:rFonts w:ascii="Georgia" w:hAnsi="Georgia" w:cs="Courier New"/>
+                <w:color w:val="000000"/>
+                <w:sz w:val="20"/>
+              </w:rPr>
+              <w:t xml:space="preserve">. Geeft de site zijn donkere, filmische karakter — geïnspireerd op Barry </w:t>
+            </w:r>
+            <w:proofErr w:type="spellStart"/>
+            <w:r>
+              <w:rPr>
+                <w:rFonts w:ascii="Georgia" w:hAnsi="Georgia" w:cs="Courier New"/>
+                <w:color w:val="000000"/>
+                <w:sz w:val="20"/>
+              </w:rPr>
+              <w:t>Lyndon</w:t>
+            </w:r>
+            <w:proofErr w:type="spellEnd"/>
+            <w:r>
+              <w:rPr>
+                <w:rFonts w:ascii="Georgia" w:hAnsi="Georgia" w:cs="Courier New"/>
+                <w:color w:val="000000"/>
+                <w:sz w:val="20"/>
+              </w:rPr>
+              <w:t>.</w:t>
             </w:r>
           </w:p>
         </w:tc>
@@ -480,12 +575,6 @@
         <w:gridCol w:w="7056"/>
       </w:tblGrid>
       <w:tr>
-        <w:tblPrEx>
-          <w:tblCellMar>
-            <w:top w:w="0" w:type="dxa"/>
-            <w:bottom w:w="0" w:type="dxa"/>
-          </w:tblCellMar>
-        </w:tblPrEx>
         <w:trPr>
           <w:trHeight w:hRule="exact" w:val="1440"/>
         </w:trPr>
@@ -529,6 +618,7 @@
                 <w:sz w:val="26"/>
               </w:rPr>
             </w:pPr>
+            <w:proofErr w:type="spellStart"/>
             <w:r>
               <w:rPr>
                 <w:rFonts w:ascii="Georgia" w:hAnsi="Georgia"/>
@@ -538,6 +628,7 @@
               </w:rPr>
               <w:t>Middenbruin</w:t>
             </w:r>
+            <w:proofErr w:type="spellEnd"/>
           </w:p>
           <w:p>
             <w:pPr>
@@ -554,8 +645,18 @@
                 <w:color w:val="777777"/>
                 <w:sz w:val="18"/>
               </w:rPr>
-              <w:t>#3D1E0A    --brown-mid</w:t>
-            </w:r>
+              <w:t>#3D1E0A    --</w:t>
+            </w:r>
+            <w:proofErr w:type="spellStart"/>
+            <w:r>
+              <w:rPr>
+                <w:rFonts w:ascii="Courier New" w:hAnsi="Courier New" w:cs="Courier New"/>
+                <w:color w:val="777777"/>
+                <w:sz w:val="18"/>
+              </w:rPr>
+              <w:t>brown-mid</w:t>
+            </w:r>
+            <w:proofErr w:type="spellEnd"/>
           </w:p>
           <w:p>
             <w:pPr>
@@ -603,12 +704,6 @@
         <w:gridCol w:w="7056"/>
       </w:tblGrid>
       <w:tr>
-        <w:tblPrEx>
-          <w:tblCellMar>
-            <w:top w:w="0" w:type="dxa"/>
-            <w:bottom w:w="0" w:type="dxa"/>
-          </w:tblCellMar>
-        </w:tblPrEx>
         <w:trPr>
           <w:trHeight w:hRule="exact" w:val="1440"/>
         </w:trPr>
@@ -677,7 +772,25 @@
                 <w:color w:val="777777"/>
                 <w:sz w:val="18"/>
               </w:rPr>
-              <w:t>#6A3C1C    --brown-light</w:t>
+              <w:t>#6A3C1C    --</w:t>
+            </w:r>
+            <w:proofErr w:type="spellStart"/>
+            <w:r>
+              <w:rPr>
+                <w:rFonts w:ascii="Courier New" w:hAnsi="Courier New" w:cs="Courier New"/>
+                <w:color w:val="777777"/>
+                <w:sz w:val="18"/>
+              </w:rPr>
+              <w:t>brown</w:t>
+            </w:r>
+            <w:proofErr w:type="spellEnd"/>
+            <w:r>
+              <w:rPr>
+                <w:rFonts w:ascii="Courier New" w:hAnsi="Courier New" w:cs="Courier New"/>
+                <w:color w:val="777777"/>
+                <w:sz w:val="18"/>
+              </w:rPr>
+              <w:t>-light</w:t>
             </w:r>
           </w:p>
           <w:p>
@@ -695,7 +808,25 @@
                 <w:color w:val="000000"/>
                 <w:sz w:val="20"/>
               </w:rPr>
-              <w:t>Subtiele details, metainformatie en secundaire tekstelementen.</w:t>
+              <w:t xml:space="preserve">Subtiele details, </w:t>
+            </w:r>
+            <w:proofErr w:type="spellStart"/>
+            <w:r>
+              <w:rPr>
+                <w:rFonts w:ascii="Georgia" w:hAnsi="Georgia" w:cs="Courier New"/>
+                <w:color w:val="000000"/>
+                <w:sz w:val="20"/>
+              </w:rPr>
+              <w:t>metainformatie</w:t>
+            </w:r>
+            <w:proofErr w:type="spellEnd"/>
+            <w:r>
+              <w:rPr>
+                <w:rFonts w:ascii="Georgia" w:hAnsi="Georgia" w:cs="Courier New"/>
+                <w:color w:val="000000"/>
+                <w:sz w:val="20"/>
+              </w:rPr>
+              <w:t xml:space="preserve"> en secundaire tekstelementen.</w:t>
             </w:r>
           </w:p>
         </w:tc>
@@ -726,12 +857,6 @@
         <w:gridCol w:w="7056"/>
       </w:tblGrid>
       <w:tr>
-        <w:tblPrEx>
-          <w:tblCellMar>
-            <w:top w:w="0" w:type="dxa"/>
-            <w:bottom w:w="0" w:type="dxa"/>
-          </w:tblCellMar>
-        </w:tblPrEx>
         <w:trPr>
           <w:trHeight w:hRule="exact" w:val="1440"/>
         </w:trPr>
@@ -756,6 +881,7 @@
                 <w:color w:val="000000"/>
                 <w:sz w:val="22"/>
               </w:rPr>
+              <w:lastRenderedPageBreak/>
               <w:t xml:space="preserve"> </w:t>
             </w:r>
           </w:p>
@@ -818,7 +944,25 @@
                 <w:color w:val="000000"/>
                 <w:sz w:val="20"/>
               </w:rPr>
-              <w:t>Accentkleur voor eyebrows, drop caps en decoratieve elementen. Verwijst naar oud leer en verouderd papier.</w:t>
+              <w:t xml:space="preserve">Accentkleur voor </w:t>
+            </w:r>
+            <w:proofErr w:type="spellStart"/>
+            <w:r>
+              <w:rPr>
+                <w:rFonts w:ascii="Georgia" w:hAnsi="Georgia" w:cs="Courier New"/>
+                <w:color w:val="000000"/>
+                <w:sz w:val="20"/>
+              </w:rPr>
+              <w:t>eyebrows</w:t>
+            </w:r>
+            <w:proofErr w:type="spellEnd"/>
+            <w:r>
+              <w:rPr>
+                <w:rFonts w:ascii="Georgia" w:hAnsi="Georgia" w:cs="Courier New"/>
+                <w:color w:val="000000"/>
+                <w:sz w:val="20"/>
+              </w:rPr>
+              <w:t>, drop caps en decoratieve elementen. Verwijst naar oud leer en verouderd papier.</w:t>
             </w:r>
           </w:p>
         </w:tc>
@@ -849,12 +993,6 @@
         <w:gridCol w:w="7056"/>
       </w:tblGrid>
       <w:tr>
-        <w:tblPrEx>
-          <w:tblCellMar>
-            <w:top w:w="0" w:type="dxa"/>
-            <w:bottom w:w="0" w:type="dxa"/>
-          </w:tblCellMar>
-        </w:tblPrEx>
         <w:trPr>
           <w:trHeight w:hRule="exact" w:val="1440"/>
         </w:trPr>
@@ -941,7 +1079,25 @@
                 <w:color w:val="000000"/>
                 <w:sz w:val="20"/>
               </w:rPr>
-              <w:t>Primaire accentkleur voor logo, ornamentjes, hover-states en CTA-knoppen. Gebaseerd op verguldsel in klassieke boekbanden.</w:t>
+              <w:t xml:space="preserve">Primaire accentkleur voor logo, ornamentjes, </w:t>
+            </w:r>
+            <w:proofErr w:type="spellStart"/>
+            <w:r>
+              <w:rPr>
+                <w:rFonts w:ascii="Georgia" w:hAnsi="Georgia" w:cs="Courier New"/>
+                <w:color w:val="000000"/>
+                <w:sz w:val="20"/>
+              </w:rPr>
+              <w:t>hover-states</w:t>
+            </w:r>
+            <w:proofErr w:type="spellEnd"/>
+            <w:r>
+              <w:rPr>
+                <w:rFonts w:ascii="Georgia" w:hAnsi="Georgia" w:cs="Courier New"/>
+                <w:color w:val="000000"/>
+                <w:sz w:val="20"/>
+              </w:rPr>
+              <w:t xml:space="preserve"> en CTA-knoppen. Gebaseerd op verguldsel in klassieke boekbanden.</w:t>
             </w:r>
           </w:p>
         </w:tc>
@@ -972,12 +1128,6 @@
         <w:gridCol w:w="7056"/>
       </w:tblGrid>
       <w:tr>
-        <w:tblPrEx>
-          <w:tblCellMar>
-            <w:top w:w="0" w:type="dxa"/>
-            <w:bottom w:w="0" w:type="dxa"/>
-          </w:tblCellMar>
-        </w:tblPrEx>
         <w:trPr>
           <w:trHeight w:hRule="exact" w:val="1440"/>
         </w:trPr>
@@ -1064,7 +1214,25 @@
                 <w:color w:val="000000"/>
                 <w:sz w:val="20"/>
               </w:rPr>
-              <w:t>Gebruik voor cursieve kopelementen en highlights op donkere achtergrond. Iets warmer en toegankelijker dan het basegoud.</w:t>
+              <w:t xml:space="preserve">Gebruik voor cursieve kopelementen en </w:t>
+            </w:r>
+            <w:proofErr w:type="spellStart"/>
+            <w:r>
+              <w:rPr>
+                <w:rFonts w:ascii="Georgia" w:hAnsi="Georgia" w:cs="Courier New"/>
+                <w:color w:val="000000"/>
+                <w:sz w:val="20"/>
+              </w:rPr>
+              <w:t>highlights</w:t>
+            </w:r>
+            <w:proofErr w:type="spellEnd"/>
+            <w:r>
+              <w:rPr>
+                <w:rFonts w:ascii="Georgia" w:hAnsi="Georgia" w:cs="Courier New"/>
+                <w:color w:val="000000"/>
+                <w:sz w:val="20"/>
+              </w:rPr>
+              <w:t xml:space="preserve"> op donkere achtergrond. Iets warmer en toegankelijker dan het basegoud.</w:t>
             </w:r>
           </w:p>
         </w:tc>
@@ -1085,10 +1253,508 @@
         <w:spacing w:after="120"/>
         <w:rPr>
           <w:rFonts w:ascii="Georgia" w:hAnsi="Georgia"/>
-          <w:color w:val="000000"/>
-          <w:sz w:val="22"/>
-        </w:rPr>
-      </w:pPr>
+          <w:b/>
+          <w:bCs/>
+          <w:color w:val="000000"/>
+          <w:sz w:val="32"/>
+          <w:szCs w:val="36"/>
+        </w:rPr>
+      </w:pPr>
+    </w:p>
+    <w:p>
+      <w:pPr>
+        <w:spacing w:after="120"/>
+        <w:rPr>
+          <w:rFonts w:ascii="Georgia" w:hAnsi="Georgia"/>
+          <w:b/>
+          <w:bCs/>
+          <w:color w:val="000000"/>
+          <w:sz w:val="32"/>
+          <w:szCs w:val="36"/>
+        </w:rPr>
+      </w:pPr>
+    </w:p>
+    <w:p>
+      <w:pPr>
+        <w:spacing w:after="120"/>
+        <w:rPr>
+          <w:rFonts w:ascii="Georgia" w:hAnsi="Georgia"/>
+          <w:b/>
+          <w:bCs/>
+          <w:color w:val="000000"/>
+          <w:sz w:val="32"/>
+          <w:szCs w:val="36"/>
+        </w:rPr>
+      </w:pPr>
+    </w:p>
+    <w:p>
+      <w:pPr>
+        <w:spacing w:after="120"/>
+        <w:rPr>
+          <w:rFonts w:ascii="Georgia" w:hAnsi="Georgia"/>
+          <w:b/>
+          <w:bCs/>
+          <w:color w:val="000000"/>
+          <w:sz w:val="32"/>
+          <w:szCs w:val="36"/>
+        </w:rPr>
+      </w:pPr>
+    </w:p>
+    <w:p>
+      <w:pPr>
+        <w:spacing w:after="120"/>
+        <w:rPr>
+          <w:rFonts w:ascii="Georgia" w:hAnsi="Georgia"/>
+          <w:b/>
+          <w:bCs/>
+          <w:color w:val="000000"/>
+          <w:sz w:val="32"/>
+          <w:szCs w:val="36"/>
+        </w:rPr>
+      </w:pPr>
+    </w:p>
+    <w:p>
+      <w:pPr>
+        <w:spacing w:after="120"/>
+        <w:rPr>
+          <w:rFonts w:ascii="Georgia" w:hAnsi="Georgia"/>
+          <w:b/>
+          <w:bCs/>
+          <w:color w:val="000000"/>
+          <w:sz w:val="32"/>
+          <w:szCs w:val="36"/>
+        </w:rPr>
+      </w:pPr>
+    </w:p>
+    <w:p>
+      <w:pPr>
+        <w:spacing w:after="120"/>
+        <w:rPr>
+          <w:rFonts w:ascii="Georgia" w:hAnsi="Georgia"/>
+          <w:b/>
+          <w:bCs/>
+          <w:color w:val="000000"/>
+          <w:sz w:val="32"/>
+          <w:szCs w:val="36"/>
+        </w:rPr>
+      </w:pPr>
+    </w:p>
+    <w:p>
+      <w:pPr>
+        <w:spacing w:after="120"/>
+        <w:rPr>
+          <w:rFonts w:ascii="Georgia" w:hAnsi="Georgia"/>
+          <w:b/>
+          <w:bCs/>
+          <w:color w:val="000000"/>
+          <w:sz w:val="32"/>
+          <w:szCs w:val="36"/>
+        </w:rPr>
+      </w:pPr>
+    </w:p>
+    <w:p>
+      <w:pPr>
+        <w:spacing w:after="120"/>
+        <w:rPr>
+          <w:rFonts w:ascii="Georgia" w:hAnsi="Georgia"/>
+          <w:b/>
+          <w:bCs/>
+          <w:color w:val="000000"/>
+          <w:sz w:val="32"/>
+          <w:szCs w:val="36"/>
+        </w:rPr>
+      </w:pPr>
+    </w:p>
+    <w:p>
+      <w:pPr>
+        <w:spacing w:after="120"/>
+        <w:rPr>
+          <w:rFonts w:ascii="Georgia" w:hAnsi="Georgia"/>
+          <w:b/>
+          <w:bCs/>
+          <w:color w:val="000000"/>
+          <w:sz w:val="32"/>
+          <w:szCs w:val="36"/>
+        </w:rPr>
+      </w:pPr>
+    </w:p>
+    <w:p>
+      <w:pPr>
+        <w:spacing w:after="120"/>
+        <w:rPr>
+          <w:rFonts w:ascii="Georgia" w:hAnsi="Georgia"/>
+          <w:b/>
+          <w:bCs/>
+          <w:color w:val="000000"/>
+          <w:sz w:val="32"/>
+          <w:szCs w:val="36"/>
+        </w:rPr>
+      </w:pPr>
+    </w:p>
+    <w:p>
+      <w:pPr>
+        <w:spacing w:after="120"/>
+        <w:rPr>
+          <w:rFonts w:ascii="Georgia" w:hAnsi="Georgia"/>
+          <w:b/>
+          <w:bCs/>
+          <w:color w:val="000000"/>
+          <w:sz w:val="32"/>
+          <w:szCs w:val="36"/>
+        </w:rPr>
+      </w:pPr>
+    </w:p>
+    <w:p>
+      <w:pPr>
+        <w:spacing w:after="120"/>
+        <w:rPr>
+          <w:rFonts w:ascii="Georgia" w:hAnsi="Georgia"/>
+          <w:b/>
+          <w:bCs/>
+          <w:color w:val="000000"/>
+          <w:sz w:val="32"/>
+          <w:szCs w:val="36"/>
+        </w:rPr>
+      </w:pPr>
+    </w:p>
+    <w:p>
+      <w:pPr>
+        <w:spacing w:after="120"/>
+        <w:rPr>
+          <w:rFonts w:ascii="Georgia" w:hAnsi="Georgia"/>
+          <w:b/>
+          <w:bCs/>
+          <w:color w:val="000000"/>
+          <w:sz w:val="32"/>
+          <w:szCs w:val="36"/>
+        </w:rPr>
+      </w:pPr>
+    </w:p>
+    <w:p>
+      <w:pPr>
+        <w:spacing w:after="120"/>
+        <w:rPr>
+          <w:rFonts w:ascii="Georgia" w:hAnsi="Georgia"/>
+          <w:b/>
+          <w:bCs/>
+          <w:color w:val="000000"/>
+          <w:sz w:val="32"/>
+          <w:szCs w:val="36"/>
+        </w:rPr>
+      </w:pPr>
+    </w:p>
+    <w:p>
+      <w:pPr>
+        <w:spacing w:after="120"/>
+        <w:rPr>
+          <w:rFonts w:ascii="Georgia" w:hAnsi="Georgia"/>
+          <w:color w:val="000000"/>
+          <w:szCs w:val="28"/>
+        </w:rPr>
+      </w:pPr>
+      <w:r>
+        <w:rPr>
+          <w:rFonts w:ascii="Georgia" w:hAnsi="Georgia"/>
+          <w:b/>
+          <w:bCs/>
+          <w:color w:val="000000"/>
+          <w:sz w:val="32"/>
+          <w:szCs w:val="36"/>
+        </w:rPr>
+        <w:lastRenderedPageBreak/>
+        <w:t>Moodboard</w:t>
+      </w:r>
+      <w:r>
+        <w:rPr>
+          <w:rFonts w:ascii="Georgia" w:hAnsi="Georgia"/>
+          <w:color w:val="000000"/>
+          <w:szCs w:val="28"/>
+        </w:rPr>
+        <w:br/>
+      </w:r>
+      <w:r>
+        <w:rPr>
+          <w:rFonts w:ascii="Georgia" w:hAnsi="Georgia"/>
+          <w:color w:val="000000"/>
+          <w:szCs w:val="28"/>
+        </w:rPr>
+        <w:t xml:space="preserve">het palet is gebaseerd op de sfeer van oude films zoals </w:t>
+      </w:r>
+      <w:proofErr w:type="spellStart"/>
+      <w:r>
+        <w:rPr>
+          <w:rFonts w:ascii="Georgia" w:hAnsi="Georgia"/>
+          <w:color w:val="000000"/>
+          <w:szCs w:val="28"/>
+        </w:rPr>
+        <w:t>barry</w:t>
+      </w:r>
+      <w:proofErr w:type="spellEnd"/>
+      <w:r>
+        <w:rPr>
+          <w:rFonts w:ascii="Georgia" w:hAnsi="Georgia"/>
+          <w:color w:val="000000"/>
+          <w:szCs w:val="28"/>
+        </w:rPr>
+        <w:t xml:space="preserve"> </w:t>
+      </w:r>
+      <w:proofErr w:type="spellStart"/>
+      <w:r>
+        <w:rPr>
+          <w:rFonts w:ascii="Georgia" w:hAnsi="Georgia"/>
+          <w:color w:val="000000"/>
+          <w:szCs w:val="28"/>
+        </w:rPr>
+        <w:t>lyndon</w:t>
+      </w:r>
+      <w:proofErr w:type="spellEnd"/>
+      <w:r>
+        <w:rPr>
+          <w:rFonts w:ascii="Georgia" w:hAnsi="Georgia"/>
+          <w:color w:val="000000"/>
+          <w:szCs w:val="28"/>
+        </w:rPr>
+        <w:t xml:space="preserve"> van </w:t>
+      </w:r>
+      <w:proofErr w:type="spellStart"/>
+      <w:r>
+        <w:rPr>
+          <w:rFonts w:ascii="Georgia" w:hAnsi="Georgia"/>
+          <w:color w:val="000000"/>
+          <w:szCs w:val="28"/>
+        </w:rPr>
+        <w:t>kubrick</w:t>
+      </w:r>
+      <w:proofErr w:type="spellEnd"/>
+      <w:r>
+        <w:rPr>
+          <w:rFonts w:ascii="Georgia" w:hAnsi="Georgia"/>
+          <w:color w:val="000000"/>
+          <w:szCs w:val="28"/>
+        </w:rPr>
+        <w:t xml:space="preserve"> </w:t>
+      </w:r>
+      <w:r>
+        <w:rPr>
+          <w:rFonts w:ascii="Georgia" w:hAnsi="Georgia"/>
+          <w:color w:val="000000"/>
+          <w:szCs w:val="28"/>
+        </w:rPr>
+        <w:t>warme kaarslichtscènes donkere achtergronden en subtiele gouden accenten die doen denken aan een achttiende-eeuws schilderij</w:t>
+      </w:r>
+    </w:p>
+    <w:p>
+      <w:pPr>
+        <w:spacing w:after="120"/>
+        <w:rPr>
+          <w:rFonts w:ascii="Georgia" w:hAnsi="Georgia"/>
+          <w:color w:val="000000"/>
+          <w:szCs w:val="28"/>
+        </w:rPr>
+      </w:pPr>
+      <w:r>
+        <w:rPr>
+          <w:rFonts w:ascii="Georgia" w:hAnsi="Georgia"/>
+          <w:color w:val="000000"/>
+          <w:szCs w:val="28"/>
+        </w:rPr>
+        <w:t>het donkerbruin vormt de basis en geeft de site een gevoel van diepte en luxe zonder te zwaar of kil te worden</w:t>
+      </w:r>
+    </w:p>
+    <w:p>
+      <w:pPr>
+        <w:spacing w:after="120"/>
+        <w:rPr>
+          <w:rFonts w:ascii="Georgia" w:hAnsi="Georgia"/>
+          <w:color w:val="000000"/>
+          <w:szCs w:val="28"/>
+        </w:rPr>
+      </w:pPr>
+      <w:r>
+        <w:rPr>
+          <w:rFonts w:ascii="Georgia" w:hAnsi="Georgia"/>
+          <w:color w:val="000000"/>
+          <w:szCs w:val="28"/>
+        </w:rPr>
+        <w:t>bordeaux voegt warmte toe als accentkleur voor titels en details het voelt klassieker aan dan een standaard rood en past goed bij het cinematografische thema</w:t>
+      </w:r>
+    </w:p>
+    <w:p>
+      <w:pPr>
+        <w:spacing w:after="120"/>
+        <w:rPr>
+          <w:rFonts w:ascii="Georgia" w:hAnsi="Georgia"/>
+          <w:color w:val="000000"/>
+          <w:szCs w:val="28"/>
+        </w:rPr>
+      </w:pPr>
+      <w:r>
+        <w:rPr>
+          <w:rFonts w:ascii="Georgia" w:hAnsi="Georgia"/>
+          <w:color w:val="000000"/>
+          <w:szCs w:val="28"/>
+        </w:rPr>
+        <w:t xml:space="preserve">het goud gebruik ik bewust maar spaarzaam voor interactieve elementen en </w:t>
+      </w:r>
+      <w:proofErr w:type="spellStart"/>
+      <w:r>
+        <w:rPr>
+          <w:rFonts w:ascii="Georgia" w:hAnsi="Georgia"/>
+          <w:color w:val="000000"/>
+          <w:szCs w:val="28"/>
+        </w:rPr>
+        <w:t>highlights</w:t>
+      </w:r>
+      <w:proofErr w:type="spellEnd"/>
+      <w:r>
+        <w:rPr>
+          <w:rFonts w:ascii="Georgia" w:hAnsi="Georgia"/>
+          <w:color w:val="000000"/>
+          <w:szCs w:val="28"/>
+        </w:rPr>
+        <w:t xml:space="preserve"> zodat het opvalt zonder de pagina te overheersen</w:t>
+      </w:r>
+    </w:p>
+    <w:p>
+      <w:pPr>
+        <w:spacing w:after="120"/>
+        <w:rPr>
+          <w:rFonts w:ascii="Georgia" w:hAnsi="Georgia"/>
+          <w:color w:val="000000"/>
+          <w:szCs w:val="28"/>
+        </w:rPr>
+      </w:pPr>
+      <w:r>
+        <w:rPr>
+          <w:rFonts w:ascii="Georgia" w:hAnsi="Georgia"/>
+          <w:b/>
+          <w:bCs/>
+          <w:color w:val="000000"/>
+          <w:sz w:val="44"/>
+          <w:szCs w:val="48"/>
+        </w:rPr>
+        <w:drawing>
+          <wp:anchor distT="0" distB="0" distL="114300" distR="114300" simplePos="0" relativeHeight="251658240" behindDoc="1" locked="0" layoutInCell="1" allowOverlap="1" wp14:anchorId="0B98B5C0" wp14:editId="2918B797">
+            <wp:simplePos x="0" y="0"/>
+            <wp:positionH relativeFrom="margin">
+              <wp:align>center</wp:align>
+            </wp:positionH>
+            <wp:positionV relativeFrom="paragraph">
+              <wp:posOffset>1592536</wp:posOffset>
+            </wp:positionV>
+            <wp:extent cx="7622864" cy="4742121"/>
+            <wp:effectExtent l="0" t="0" r="0" b="1905"/>
+            <wp:wrapNone/>
+            <wp:docPr id="797960275" name="Afbeelding 1"/>
+            <wp:cNvGraphicFramePr>
+              <a:graphicFrameLocks xmlns:a="http://schemas.openxmlformats.org/drawingml/2006/main" noChangeAspect="1"/>
+            </wp:cNvGraphicFramePr>
+            <a:graphic xmlns:a="http://schemas.openxmlformats.org/drawingml/2006/main">
+              <a:graphicData uri="http://schemas.openxmlformats.org/drawingml/2006/picture">
+                <pic:pic xmlns:pic="http://schemas.openxmlformats.org/drawingml/2006/picture">
+                  <pic:nvPicPr>
+                    <pic:cNvPr id="797960275" name=""/>
+                    <pic:cNvPicPr/>
+                  </pic:nvPicPr>
+                  <pic:blipFill>
+                    <a:blip r:embed="rId4">
+                      <a:extLst>
+                        <a:ext uri="{28A0092B-C50C-407E-A947-70E740481C1C}">
+                          <a14:useLocalDpi xmlns:a14="http://schemas.microsoft.com/office/drawing/2010/main" val="0"/>
+                        </a:ext>
+                      </a:extLst>
+                    </a:blip>
+                    <a:stretch>
+                      <a:fillRect/>
+                    </a:stretch>
+                  </pic:blipFill>
+                  <pic:spPr>
+                    <a:xfrm>
+                      <a:off x="0" y="0"/>
+                      <a:ext cx="7622864" cy="4742121"/>
+                    </a:xfrm>
+                    <a:prstGeom prst="rect">
+                      <a:avLst/>
+                    </a:prstGeom>
+                  </pic:spPr>
+                </pic:pic>
+              </a:graphicData>
+            </a:graphic>
+          </wp:anchor>
+        </w:drawing>
+      </w:r>
+      <w:r>
+        <w:rPr>
+          <w:rFonts w:ascii="Georgia" w:hAnsi="Georgia"/>
+          <w:color w:val="000000"/>
+          <w:szCs w:val="28"/>
+        </w:rPr>
+        <w:t>het gebroken wit op de lichte secties voelt warmer aan dan puur wit en past beter bij de organische stijl van het portfolio</w:t>
+      </w:r>
+    </w:p>
+    <w:p>
+      <w:pPr>
+        <w:spacing w:after="120"/>
+        <w:rPr>
+          <w:rFonts w:ascii="Georgia" w:hAnsi="Georgia"/>
+          <w:color w:val="000000"/>
+          <w:szCs w:val="28"/>
+        </w:rPr>
+      </w:pPr>
+      <w:r>
+        <w:rPr>
+          <w:rFonts w:ascii="Georgia" w:hAnsi="Georgia"/>
+          <w:color w:val="000000"/>
+          <w:szCs w:val="28"/>
+        </w:rPr>
+        <w:t xml:space="preserve">Mijn </w:t>
+      </w:r>
+      <w:proofErr w:type="spellStart"/>
+      <w:r>
+        <w:rPr>
+          <w:rFonts w:ascii="Georgia" w:hAnsi="Georgia"/>
+          <w:color w:val="000000"/>
+          <w:szCs w:val="28"/>
+        </w:rPr>
+        <w:t>main</w:t>
+      </w:r>
+      <w:proofErr w:type="spellEnd"/>
+      <w:r>
+        <w:rPr>
+          <w:rFonts w:ascii="Georgia" w:hAnsi="Georgia"/>
+          <w:color w:val="000000"/>
+          <w:szCs w:val="28"/>
+        </w:rPr>
+        <w:t xml:space="preserve"> reden waarom ik voor deze kleuren heb gekozen is om los te breken van de minimalistische designs die we vandaag de dag hebben en </w:t>
+      </w:r>
+      <w:proofErr w:type="spellStart"/>
+      <w:r>
+        <w:rPr>
+          <w:rFonts w:ascii="Georgia" w:hAnsi="Georgia"/>
+          <w:color w:val="000000"/>
+          <w:szCs w:val="28"/>
+        </w:rPr>
+        <w:t>inplaats</w:t>
+      </w:r>
+      <w:proofErr w:type="spellEnd"/>
+      <w:r>
+        <w:rPr>
+          <w:rFonts w:ascii="Georgia" w:hAnsi="Georgia"/>
+          <w:color w:val="000000"/>
+          <w:szCs w:val="28"/>
+        </w:rPr>
+        <w:t xml:space="preserve"> daarvan inspiratie kunnen opdoen op klassieke kunst en </w:t>
+      </w:r>
+      <w:proofErr w:type="spellStart"/>
+      <w:r>
+        <w:rPr>
+          <w:rFonts w:ascii="Georgia" w:hAnsi="Georgia"/>
+          <w:color w:val="000000"/>
+          <w:szCs w:val="28"/>
+        </w:rPr>
+        <w:t>aesthetic</w:t>
+      </w:r>
+      <w:proofErr w:type="spellEnd"/>
     </w:p>
     <w:sectPr>
       <w:pgSz w:w="11906" w:h="16838"/>
@@ -1703,7 +2369,6 @@
   <w:style w:type="character" w:default="1" w:styleId="Standaardalinea-lettertype">
     <w:name w:val="Default Paragraph Font"/>
     <w:uiPriority w:val="1"/>
-    <w:semiHidden/>
     <w:unhideWhenUsed/>
   </w:style>
   <w:style w:type="table" w:default="1" w:styleId="Standaardtabel">
@@ -2015,6 +2680,17 @@
       <w:smallCaps/>
       <w:color w:val="0F4761" w:themeColor="accent1" w:themeShade="BF"/>
       <w:spacing w:val="5"/>
+    </w:rPr>
+  </w:style>
+  <w:style w:type="paragraph" w:styleId="Normaalweb">
+    <w:name w:val="Normal (Web)"/>
+    <w:basedOn w:val="Standaard"/>
+    <w:uiPriority w:val="99"/>
+    <w:semiHidden/>
+    <w:unhideWhenUsed/>
+    <w:rsid w:val="00406252"/>
+    <w:rPr>
+      <w:rFonts w:ascii="Times New Roman" w:hAnsi="Times New Roman" w:cs="Times New Roman"/>
     </w:rPr>
   </w:style>
 </w:styles>

</xml_diff>